<commit_message>
Final project: data re-check, confidence tiers, 6-slide deck
- independent rebuild confirms the 2022 analysis set, cost model and top-10 premiums
- new price-trend flag (2018-22 growth above metro 99th percentile; Stearns MN, McLean IL)
  and confidence tiers in final_analysis.py and the Word document
- build_slides.js generates Final_Project_Slides.pptx (native charts, speaker notes)

Co-Authored-By: Claude Opus 5.5 <noreply@anthropic.com>
</commit_message>
<xml_diff>
--- a/Final_Project_Analysis.docx
+++ b/Final_Project_Analysis.docx
@@ -413,10 +413,18 @@
     <w:tbl>
       <w:tblPr>
         <w:tblStyle w:val="Table"/>
-        <w:tblW w:type="pct" w:w="0.0"/>
+        <w:tblW w:type="pct" w:w="4999.999999999999"/>
         <w:tblLook w:firstRow="1" w:lastRow="0" w:firstColumn="0" w:lastColumn="0" w:noHBand="0" w:noVBand="0"/>
       </w:tblPr>
-      <w:tblGrid/>
+      <w:tblGrid>
+        <w:gridCol w:w="1131"/>
+        <w:gridCol w:w="1131"/>
+        <w:gridCol w:w="1131"/>
+        <w:gridCol w:w="1131"/>
+        <w:gridCol w:w="1131"/>
+        <w:gridCol w:w="1131"/>
+        <w:gridCol w:w="1131"/>
+      </w:tblGrid>
       <w:tr>
         <w:trPr>
           <w:cnfStyle w:firstRow="1"/>
@@ -523,6 +531,23 @@
             </w:r>
           </w:p>
         </w:tc>
+        <w:tc>
+          <w:tcPr>
+            <w:tcBorders>
+              <w:bottom w:val="single"/>
+            </w:tcBorders>
+            <w:vAlign w:val="bottom"/>
+          </w:tcPr>
+          <w:p>
+            <w:pPr>
+              <w:pStyle w:val="Compact"/>
+              <w:jc w:val="left"/>
+            </w:pPr>
+            <w:r>
+              <w:t xml:space="preserve">Confidence</w:t>
+            </w:r>
+          </w:p>
+        </w:tc>
       </w:tr>
       <w:tr>
         <w:tc>
@@ -600,6 +625,17 @@
             </w:r>
           </w:p>
         </w:tc>
+        <w:tc>
+          <w:p>
+            <w:pPr>
+              <w:pStyle w:val="Compact"/>
+              <w:jc w:val="left"/>
+            </w:pPr>
+            <w:r>
+              <w:t xml:space="preserve">High</w:t>
+            </w:r>
+          </w:p>
+        </w:tc>
       </w:tr>
       <w:tr>
         <w:tc>
@@ -677,6 +713,17 @@
             </w:r>
           </w:p>
         </w:tc>
+        <w:tc>
+          <w:p>
+            <w:pPr>
+              <w:pStyle w:val="Compact"/>
+              <w:jc w:val="left"/>
+            </w:pPr>
+            <w:r>
+              <w:t xml:space="preserve">Verify: price trend</w:t>
+            </w:r>
+          </w:p>
+        </w:tc>
       </w:tr>
       <w:tr>
         <w:tc>
@@ -754,6 +801,17 @@
             </w:r>
           </w:p>
         </w:tc>
+        <w:tc>
+          <w:p>
+            <w:pPr>
+              <w:pStyle w:val="Compact"/>
+              <w:jc w:val="left"/>
+            </w:pPr>
+            <w:r>
+              <w:t xml:space="preserve">High</w:t>
+            </w:r>
+          </w:p>
+        </w:tc>
       </w:tr>
       <w:tr>
         <w:tc>
@@ -831,6 +889,17 @@
             </w:r>
           </w:p>
         </w:tc>
+        <w:tc>
+          <w:p>
+            <w:pPr>
+              <w:pStyle w:val="Compact"/>
+              <w:jc w:val="left"/>
+            </w:pPr>
+            <w:r>
+              <w:t xml:space="preserve">High</w:t>
+            </w:r>
+          </w:p>
+        </w:tc>
       </w:tr>
       <w:tr>
         <w:tc>
@@ -908,6 +977,17 @@
             </w:r>
           </w:p>
         </w:tc>
+        <w:tc>
+          <w:p>
+            <w:pPr>
+              <w:pStyle w:val="Compact"/>
+              <w:jc w:val="left"/>
+            </w:pPr>
+            <w:r>
+              <w:t xml:space="preserve">Verify: regional price</w:t>
+            </w:r>
+          </w:p>
+        </w:tc>
       </w:tr>
       <w:tr>
         <w:tc>
@@ -985,6 +1065,17 @@
             </w:r>
           </w:p>
         </w:tc>
+        <w:tc>
+          <w:p>
+            <w:pPr>
+              <w:pStyle w:val="Compact"/>
+              <w:jc w:val="left"/>
+            </w:pPr>
+            <w:r>
+              <w:t xml:space="preserve">Verify: regional price</w:t>
+            </w:r>
+          </w:p>
+        </w:tc>
       </w:tr>
       <w:tr>
         <w:tc>
@@ -1062,6 +1153,17 @@
             </w:r>
           </w:p>
         </w:tc>
+        <w:tc>
+          <w:p>
+            <w:pPr>
+              <w:pStyle w:val="Compact"/>
+              <w:jc w:val="left"/>
+            </w:pPr>
+            <w:r>
+              <w:t xml:space="preserve">Verify: regional price</w:t>
+            </w:r>
+          </w:p>
+        </w:tc>
       </w:tr>
       <w:tr>
         <w:tc>
@@ -1139,6 +1241,17 @@
             </w:r>
           </w:p>
         </w:tc>
+        <w:tc>
+          <w:p>
+            <w:pPr>
+              <w:pStyle w:val="Compact"/>
+              <w:jc w:val="left"/>
+            </w:pPr>
+            <w:r>
+              <w:t xml:space="preserve">High</w:t>
+            </w:r>
+          </w:p>
+        </w:tc>
       </w:tr>
       <w:tr>
         <w:tc>
@@ -1216,6 +1329,17 @@
             </w:r>
           </w:p>
         </w:tc>
+        <w:tc>
+          <w:p>
+            <w:pPr>
+              <w:pStyle w:val="Compact"/>
+              <w:jc w:val="left"/>
+            </w:pPr>
+            <w:r>
+              <w:t xml:space="preserve">Verify: price trend</w:t>
+            </w:r>
+          </w:p>
+        </w:tc>
       </w:tr>
       <w:tr>
         <w:tc>
@@ -1293,6 +1417,17 @@
             </w:r>
           </w:p>
         </w:tc>
+        <w:tc>
+          <w:p>
+            <w:pPr>
+              <w:pStyle w:val="Compact"/>
+              <w:jc w:val="left"/>
+            </w:pPr>
+            <w:r>
+              <w:t xml:space="preserve">Verify: regional price</w:t>
+            </w:r>
+          </w:p>
+        </w:tc>
       </w:tr>
     </w:tbl>
     <w:p>
@@ -1333,13 +1468,19 @@
         <w:rPr>
           <w:b/>
         </w:rPr>
-        <w:t xml:space="preserve">Reliability caveat:</w:t>
-      </w:r>
-      <w:r>
-        <w:t xml:space="preserve"> </w:t>
-      </w:r>
-      <w:r>
-        <w:t xml:space="preserve">four of the ten (the three Wisconsin counties and Olmsted, MN) report a</w:t>
+        <w:t xml:space="preserve">Confidence:</w:t>
+      </w:r>
+      <w:r>
+        <w:t xml:space="preserve"> </w:t>
+      </w:r>
+      <w:r>
+        <w:t xml:space="preserve">four picks (Arlington, Alexandria, San Francisco, Norfolk) pass every data check.</w:t>
+      </w:r>
+      <w:r>
+        <w:t xml:space="preserve"> </w:t>
+      </w:r>
+      <w:r>
+        <w:t xml:space="preserve">Four (the three Wisconsin counties and Olmsted, MN) report a</w:t>
       </w:r>
       <w:r>
         <w:t xml:space="preserve"> </w:t>
@@ -1354,19 +1495,25 @@
         <w:t xml:space="preserve"> </w:t>
       </w:r>
       <w:r>
-        <w:t xml:space="preserve">price shared with 7–8 other counties in their state, so their premium is less certain. Section (b)</w:t>
-      </w:r>
-      <w:r>
-        <w:t xml:space="preserve"> </w:t>
-      </w:r>
-      <w:r>
-        <w:t xml:space="preserve">gives a robustness list using only county-specific prices, which replaces them with Howard County MD, Burlington</w:t>
-      </w:r>
-      <w:r>
-        <w:t xml:space="preserve"> </w:t>
-      </w:r>
-      <w:r>
-        <w:t xml:space="preserve">County NJ, DuPage County IL and Gloucester County NJ.</w:t>
+        <w:t xml:space="preserve">price shared with 7–8 other counties in their</w:t>
+      </w:r>
+      <w:r>
+        <w:t xml:space="preserve"> </w:t>
+      </w:r>
+      <w:r>
+        <w:t xml:space="preserve">state. Two (Stearns, MN and McLean, IL) rest on a 2018–2022 price rise above the 99th percentile of metro counties</w:t>
+      </w:r>
+      <w:r>
+        <w:t xml:space="preserve"> </w:t>
+      </w:r>
+      <w:r>
+        <w:t xml:space="preserve">(+77% and +59% vs. a median of +11%), which NDCP partly extends by straight-line interpolation between surveys.</w:t>
+      </w:r>
+      <w:r>
+        <w:t xml:space="preserve"> </w:t>
+      </w:r>
+      <w:r>
+        <w:t xml:space="preserve">These six should be confirmed with local price data; section (b) gives a fully high-confidence alternative list.</w:t>
       </w:r>
     </w:p>
     <w:bookmarkEnd w:id="21"/>
@@ -4313,6 +4460,41 @@
           </w:p>
         </w:tc>
       </w:tr>
+      <w:tr>
+        <w:tc>
+          <w:p>
+            <w:pPr>
+              <w:pStyle w:val="Compact"/>
+              <w:jc w:val="left"/>
+            </w:pPr>
+            <w:r>
+              <w:t xml:space="preserve">Price trends</w:t>
+            </w:r>
+          </w:p>
+        </w:tc>
+        <w:tc>
+          <w:p>
+            <w:pPr>
+              <w:pStyle w:val="Compact"/>
+              <w:jc w:val="left"/>
+            </w:pPr>
+            <w:r>
+              <w:t xml:space="preserve">NDCP fills years between surveys with straight lines (77% of metro counties have exactly linear 2019–2022 prices); 2018–2022 growth median +10.6%, 99th percentile +55.5%</w:t>
+            </w:r>
+          </w:p>
+        </w:tc>
+        <w:tc>
+          <w:p>
+            <w:pPr>
+              <w:pStyle w:val="Compact"/>
+              <w:jc w:val="left"/>
+            </w:pPr>
+            <w:r>
+              <w:t xml:space="preserve">Stearns MN (+77%) and McLean IL (+59%) are extreme; their 2022 premium may partly be an extrapolated trend</w:t>
+            </w:r>
+          </w:p>
+        </w:tc>
+      </w:tr>
     </w:tbl>
     <w:p>
       <w:pPr>
@@ -4925,19 +5107,73 @@
         <w:pStyle w:val="BodyText"/>
       </w:pPr>
       <w:r>
+        <w:t xml:space="preserve">Six of the ten survive this check. Adding the price-trend check removes Stearns and McLean as well.</w:t>
+      </w:r>
+      <w:r>
+        <w:t xml:space="preserve"> </w:t>
+      </w:r>
+      <w:r>
         <w:rPr>
           <w:b/>
         </w:rPr>
-        <w:t xml:space="preserve">Six of our ten picks survive every check</w:t>
-      </w:r>
-      <w:r>
-        <w:t xml:space="preserve">, so we consider them high-confidence. Winnebago, La Crosse and Brown</w:t>
-      </w:r>
-      <w:r>
-        <w:t xml:space="preserve"> </w:t>
-      </w:r>
-      <w:r>
-        <w:t xml:space="preserve">(WI) and Olmsted (MN) are promising but should be confirmed with local price data before committing capital.</w:t>
+        <w:t xml:space="preserve">High-confidence</w:t>
+      </w:r>
+      <w:r>
+        <w:rPr>
+          <w:b/>
+        </w:rPr>
+        <w:t xml:space="preserve"> </w:t>
+      </w:r>
+      <w:r>
+        <w:rPr>
+          <w:b/>
+        </w:rPr>
+        <w:t xml:space="preserve">list</w:t>
+      </w:r>
+      <w:r>
+        <w:t xml:space="preserve"> </w:t>
+      </w:r>
+      <w:r>
+        <w:t xml:space="preserve">(county-specific price and a normal 2018–2022 price trend), ranked by premium: Arlington VA (+$201),</w:t>
+      </w:r>
+      <w:r>
+        <w:t xml:space="preserve"> </w:t>
+      </w:r>
+      <w:r>
+        <w:t xml:space="preserve">Alexandria VA (+$143), San Francisco CA (+$143), Norfolk MA (+$116), Howard MD (+$89), Burlington NJ (+$88),</w:t>
+      </w:r>
+      <w:r>
+        <w:t xml:space="preserve"> </w:t>
+      </w:r>
+      <w:r>
+        <w:t xml:space="preserve">DuPage IL (+$86), Gloucester NJ (+$85), King WA (+$83) and Cumberland NJ (+$80).</w:t>
+      </w:r>
+      <w:r>
+        <w:t xml:space="preserve"> </w:t>
+      </w:r>
+      <w:r>
+        <w:rPr>
+          <w:b/>
+        </w:rPr>
+        <w:t xml:space="preserve">Our recommendation:</w:t>
+      </w:r>
+      <w:r>
+        <w:t xml:space="preserve"> </w:t>
+      </w:r>
+      <w:r>
+        <w:t xml:space="preserve">lead with</w:t>
+      </w:r>
+      <w:r>
+        <w:t xml:space="preserve"> </w:t>
+      </w:r>
+      <w:r>
+        <w:t xml:space="preserve">the four counties that are in both lists, and treat the other six main picks as candidates to confirm with local</w:t>
+      </w:r>
+      <w:r>
+        <w:t xml:space="preserve"> </w:t>
+      </w:r>
+      <w:r>
+        <w:t xml:space="preserve">price data before committing capital.</w:t>
       </w:r>
     </w:p>
     <w:bookmarkEnd w:id="32"/>
@@ -6455,6 +6691,39 @@
       </w:r>
       <w:r>
         <w:t xml:space="preserve">2022 price; a county-specific-price ranking is reported as a robustness check.</w:t>
+      </w:r>
+    </w:p>
+    <w:p>
+      <w:pPr>
+        <w:numPr>
+          <w:ilvl w:val="0"/>
+          <w:numId w:val="1007"/>
+        </w:numPr>
+        <w:pStyle w:val="Compact"/>
+      </w:pPr>
+      <w:r>
+        <w:rPr>
+          <w:b/>
+        </w:rPr>
+        <w:t xml:space="preserve">Price-trend check:</w:t>
+      </w:r>
+      <w:r>
+        <w:t xml:space="preserve"> </w:t>
+      </w:r>
+      <w:r>
+        <w:t xml:space="preserve">counties whose nominal 2018–2022 price growth exceeds the 99th percentile of metro counties</w:t>
+      </w:r>
+      <w:r>
+        <w:t xml:space="preserve"> </w:t>
+      </w:r>
+      <w:r>
+        <w:t xml:space="preserve">(+55.5%) are flagged, because NDCP interpolates linearly between state surveys and an extreme trend may be</w:t>
+      </w:r>
+      <w:r>
+        <w:t xml:space="preserve"> </w:t>
+      </w:r>
+      <w:r>
+        <w:t xml:space="preserve">extrapolated. The ranking itself is unchanged; the flag sets the confidence tier.</w:t>
       </w:r>
     </w:p>
     <w:p>

</xml_diff>

<commit_message>
Slides v2: team review (Gary, Claudia) folded into the reproducible build
- RMSE ($37/wk) replaces the R² range; premiums shown as 2.7-5.4x RMSE
- signal vs noise ($31 vs $15), all-county 2019->2022 slope (0.90, 974), within-state ranks
- wording fixes: $100-$201, ">= 3 of 4" screen, "All 998 metro", "(712 counties)"
- missing factors: OEWS 39-9011 excludes preschool teachers (SOC 25-2011)
- all new statistics computed in final_analysis.py; Word document updated to match

Co-Authored-By: Claude Opus 5.5 <noreply@anthropic.com>
</commit_message>
<xml_diff>
--- a/Final_Project_Analysis.docx
+++ b/Final_Project_Analysis.docx
@@ -4229,18 +4229,18 @@
               <w:t xml:space="preserve"> </w:t>
             </w:r>
             <w:r>
-              <w:t xml:space="preserve">between 0.56 and 0.67 in every year</w:t>
-            </w:r>
-          </w:p>
-        </w:tc>
-        <w:tc>
-          <w:p>
-            <w:pPr>
-              <w:pStyle w:val="Compact"/>
-              <w:jc w:val="left"/>
-            </w:pPr>
-            <w:r>
-              <w:t xml:space="preserve">Costs explain most, not all, of price differences</w:t>
+              <w:t xml:space="preserve">between 0.56 and 0.67 in every year; 2022 RMSE $37/week</w:t>
+            </w:r>
+          </w:p>
+        </w:tc>
+        <w:tc>
+          <w:p>
+            <w:pPr>
+              <w:pStyle w:val="Compact"/>
+              <w:jc w:val="left"/>
+            </w:pPr>
+            <w:r>
+              <w:t xml:space="preserve">Costs explain most, not all, of price differences; the unexplained part is the premium we rank on, and the top 10 premiums are 2.7–5.4× the RMSE</w:t>
             </w:r>
           </w:p>
         </w:tc>
@@ -4324,16 +4324,22 @@
                 <m:t>0.67</m:t>
               </m:r>
             </m:oMath>
-          </w:p>
-        </w:tc>
-        <w:tc>
-          <w:p>
-            <w:pPr>
-              <w:pStyle w:val="Compact"/>
-              <w:jc w:val="left"/>
-            </w:pPr>
-            <w:r>
-              <w:t xml:space="preserve">Premiums are a persistent market feature</w:t>
+            <w:r>
+              <w:t xml:space="preserve"> </w:t>
+            </w:r>
+            <w:r>
+              <w:t xml:space="preserve">(712 counties; 0.90 across all 974 counties observed in both years)</w:t>
+            </w:r>
+          </w:p>
+        </w:tc>
+        <w:tc>
+          <w:p>
+            <w:pPr>
+              <w:pStyle w:val="Compact"/>
+              <w:jc w:val="left"/>
+            </w:pPr>
+            <w:r>
+              <w:t xml:space="preserve">Premiums are a persistent market feature: knowing the 2019 premium cuts the 2022 price error from $37 to $22</w:t>
             </w:r>
           </w:p>
         </w:tc>
@@ -4421,6 +4427,76 @@
             </w:pPr>
             <w:r>
               <w:t xml:space="preserve">Coefficients stay valid; very high-price counties are less predictable</w:t>
+            </w:r>
+          </w:p>
+        </w:tc>
+      </w:tr>
+      <w:tr>
+        <w:tc>
+          <w:p>
+            <w:pPr>
+              <w:pStyle w:val="Compact"/>
+              <w:jc w:val="left"/>
+            </w:pPr>
+            <w:r>
+              <w:t xml:space="preserve">Signal vs. noise</w:t>
+            </w:r>
+          </w:p>
+        </w:tc>
+        <w:tc>
+          <w:p>
+            <w:pPr>
+              <w:pStyle w:val="Compact"/>
+              <w:jc w:val="left"/>
+            </w:pPr>
+            <w:r>
+              <w:t xml:space="preserve">SD of each county’s average premium $31/week vs. SD of its year-to-year deviations $15</w:t>
+            </w:r>
+          </w:p>
+        </w:tc>
+        <w:tc>
+          <w:p>
+            <w:pPr>
+              <w:pStyle w:val="Compact"/>
+              <w:jc w:val="left"/>
+            </w:pPr>
+            <w:r>
+              <w:t xml:space="preserve">The lasting part of a premium is about twice the yearly noise</w:t>
+            </w:r>
+          </w:p>
+        </w:tc>
+      </w:tr>
+      <w:tr>
+        <w:tc>
+          <w:p>
+            <w:pPr>
+              <w:pStyle w:val="Compact"/>
+              <w:jc w:val="left"/>
+            </w:pPr>
+            <w:r>
+              <w:t xml:space="preserve">Within-state model</w:t>
+            </w:r>
+          </w:p>
+        </w:tc>
+        <w:tc>
+          <w:p>
+            <w:pPr>
+              <w:pStyle w:val="Compact"/>
+              <w:jc w:val="left"/>
+            </w:pPr>
+            <w:r>
+              <w:t xml:space="preserve">adding state fixed effects to the cost model keeps the four high-confidence picks at ranks 1, 2, 3 and 8</w:t>
+            </w:r>
+          </w:p>
+        </w:tc>
+        <w:tc>
+          <w:p>
+            <w:pPr>
+              <w:pStyle w:val="Compact"/>
+              <w:jc w:val="left"/>
+            </w:pPr>
+            <w:r>
+              <w:t xml:space="preserve">Their premiums are not just a state effect</w:t>
             </w:r>
           </w:p>
         </w:tc>
@@ -6136,19 +6212,25 @@
         <w:rPr>
           <w:b/>
         </w:rPr>
-        <w:t xml:space="preserve">Regulation and staffing ratios.</w:t>
-      </w:r>
-      <w:r>
-        <w:t xml:space="preserve"> </w:t>
-      </w:r>
-      <w:r>
-        <w:t xml:space="preserve">States with strict staff-to-child ratios or credential rules (Minnesota is</w:t>
-      </w:r>
-      <w:r>
-        <w:t xml:space="preserve"> </w:t>
-      </w:r>
-      <w:r>
-        <w:t xml:space="preserve">among the strictest) raise labor cost</w:t>
+        <w:t xml:space="preserve">Labor cost measurement, regulation and staffing ratios.</w:t>
+      </w:r>
+      <w:r>
+        <w:t xml:space="preserve"> </w:t>
+      </w:r>
+      <w:r>
+        <w:t xml:space="preserve">The OEWS wage we use covers childcare workers (SOC</w:t>
+      </w:r>
+      <w:r>
+        <w:t xml:space="preserve"> </w:t>
+      </w:r>
+      <w:r>
+        <w:t xml:space="preserve">39-9011) and excludes preschool teachers (SOC 25-2011), who staff many center classrooms and earn more. States with</w:t>
+      </w:r>
+      <w:r>
+        <w:t xml:space="preserve"> </w:t>
+      </w:r>
+      <w:r>
+        <w:t xml:space="preserve">strict staff-to-child ratios or credential rules (Minnesota is among the strictest) also raise labor cost</w:t>
       </w:r>
       <w:r>
         <w:t xml:space="preserve"> </w:t>
@@ -6157,19 +6239,25 @@
         <w:rPr>
           <w:i/>
         </w:rPr>
-        <w:t xml:space="preserve">per child</w:t>
-      </w:r>
-      <w:r>
-        <w:t xml:space="preserve"> </w:t>
-      </w:r>
-      <w:r>
-        <w:t xml:space="preserve">beyond the wage level we measure. Part of a Minnesota premium</w:t>
-      </w:r>
-      <w:r>
-        <w:t xml:space="preserve"> </w:t>
-      </w:r>
-      <w:r>
-        <w:t xml:space="preserve">may be cost, not margin.</w:t>
+        <w:t xml:space="preserve">per</w:t>
+      </w:r>
+      <w:r>
+        <w:rPr>
+          <w:i/>
+        </w:rPr>
+        <w:t xml:space="preserve"> </w:t>
+      </w:r>
+      <w:r>
+        <w:rPr>
+          <w:i/>
+        </w:rPr>
+        <w:t xml:space="preserve">child</w:t>
+      </w:r>
+      <w:r>
+        <w:t xml:space="preserve"> </w:t>
+      </w:r>
+      <w:r>
+        <w:t xml:space="preserve">beyond the wage level we measure, so part of a Minnesota premium may be cost, not margin.</w:t>
       </w:r>
     </w:p>
     <w:p>

</xml_diff>